<commit_message>
Menú de pausa con ESC: continuar, otro nivel o menú
- Escena Pause sobre Game; el reloj de la escena descuenta lo pausado
- Otro nivel regenera el mapa conservando puntaje y muertes
- Controles en el GDD (md, docx, pdf)

Co-Authored-By: Claude Sonnet 5.5 <noreply@anthropic.com>
</commit_message>
<xml_diff>
--- a/docs/GDD.docx
+++ b/docs/GDD.docx
@@ -335,14 +335,14 @@
         </w:tblBorders>
       </w:tblPr>
       <w:tblGrid>
-        <w:gridCol w:w="2530"/>
-        <w:gridCol w:w="6830"/>
+        <w:gridCol w:w="3744"/>
+        <w:gridCol w:w="5616"/>
       </w:tblGrid>
       <w:tr>
         <w:tc>
           <w:tcPr>
             <w:tcW w:type="dxa" w:w="4680"/>
-            <w:tcW w:type="dxa" w:w="2530"/>
+            <w:tcW w:type="dxa" w:w="3744"/>
             <w:tcBorders>
               <w:top w:val="single" w:sz="4" w:color="BBBBBB"/>
               <w:left w:val="single" w:sz="4" w:color="BBBBBB"/>
@@ -366,7 +366,7 @@
         <w:tc>
           <w:tcPr>
             <w:tcW w:type="dxa" w:w="4680"/>
-            <w:tcW w:type="dxa" w:w="6830"/>
+            <w:tcW w:type="dxa" w:w="5616"/>
             <w:tcBorders>
               <w:top w:val="single" w:sz="4" w:color="BBBBBB"/>
               <w:left w:val="single" w:sz="4" w:color="BBBBBB"/>
@@ -392,7 +392,7 @@
         <w:tc>
           <w:tcPr>
             <w:tcW w:type="dxa" w:w="4680"/>
-            <w:tcW w:type="dxa" w:w="2530"/>
+            <w:tcW w:type="dxa" w:w="3744"/>
             <w:tcBorders>
               <w:top w:val="single" w:sz="4" w:color="BBBBBB"/>
               <w:left w:val="single" w:sz="4" w:color="BBBBBB"/>
@@ -412,7 +412,7 @@
         <w:tc>
           <w:tcPr>
             <w:tcW w:type="dxa" w:w="4680"/>
-            <w:tcW w:type="dxa" w:w="6830"/>
+            <w:tcW w:type="dxa" w:w="5616"/>
             <w:tcBorders>
               <w:top w:val="single" w:sz="4" w:color="BBBBBB"/>
               <w:left w:val="single" w:sz="4" w:color="BBBBBB"/>
@@ -434,7 +434,7 @@
         <w:tc>
           <w:tcPr>
             <w:tcW w:type="dxa" w:w="4680"/>
-            <w:tcW w:type="dxa" w:w="2530"/>
+            <w:tcW w:type="dxa" w:w="3744"/>
             <w:tcBorders>
               <w:top w:val="single" w:sz="4" w:color="BBBBBB"/>
               <w:left w:val="single" w:sz="4" w:color="BBBBBB"/>
@@ -454,7 +454,7 @@
         <w:tc>
           <w:tcPr>
             <w:tcW w:type="dxa" w:w="4680"/>
-            <w:tcW w:type="dxa" w:w="6830"/>
+            <w:tcW w:type="dxa" w:w="5616"/>
             <w:tcBorders>
               <w:top w:val="single" w:sz="4" w:color="BBBBBB"/>
               <w:left w:val="single" w:sz="4" w:color="BBBBBB"/>
@@ -476,7 +476,7 @@
         <w:tc>
           <w:tcPr>
             <w:tcW w:type="dxa" w:w="4680"/>
-            <w:tcW w:type="dxa" w:w="2530"/>
+            <w:tcW w:type="dxa" w:w="3744"/>
             <w:tcBorders>
               <w:top w:val="single" w:sz="4" w:color="BBBBBB"/>
               <w:left w:val="single" w:sz="4" w:color="BBBBBB"/>
@@ -496,7 +496,7 @@
         <w:tc>
           <w:tcPr>
             <w:tcW w:type="dxa" w:w="4680"/>
-            <w:tcW w:type="dxa" w:w="6830"/>
+            <w:tcW w:type="dxa" w:w="5616"/>
             <w:tcBorders>
               <w:top w:val="single" w:sz="4" w:color="BBBBBB"/>
               <w:left w:val="single" w:sz="4" w:color="BBBBBB"/>
@@ -518,7 +518,7 @@
         <w:tc>
           <w:tcPr>
             <w:tcW w:type="dxa" w:w="4680"/>
-            <w:tcW w:type="dxa" w:w="2530"/>
+            <w:tcW w:type="dxa" w:w="3744"/>
             <w:tcBorders>
               <w:top w:val="single" w:sz="4" w:color="BBBBBB"/>
               <w:left w:val="single" w:sz="4" w:color="BBBBBB"/>
@@ -538,7 +538,7 @@
         <w:tc>
           <w:tcPr>
             <w:tcW w:type="dxa" w:w="4680"/>
-            <w:tcW w:type="dxa" w:w="6830"/>
+            <w:tcW w:type="dxa" w:w="5616"/>
             <w:tcBorders>
               <w:top w:val="single" w:sz="4" w:color="BBBBBB"/>
               <w:left w:val="single" w:sz="4" w:color="BBBBBB"/>
@@ -560,7 +560,7 @@
         <w:tc>
           <w:tcPr>
             <w:tcW w:type="dxa" w:w="4680"/>
-            <w:tcW w:type="dxa" w:w="2530"/>
+            <w:tcW w:type="dxa" w:w="3744"/>
             <w:tcBorders>
               <w:top w:val="single" w:sz="4" w:color="BBBBBB"/>
               <w:left w:val="single" w:sz="4" w:color="BBBBBB"/>
@@ -580,7 +580,7 @@
         <w:tc>
           <w:tcPr>
             <w:tcW w:type="dxa" w:w="4680"/>
-            <w:tcW w:type="dxa" w:w="6830"/>
+            <w:tcW w:type="dxa" w:w="5616"/>
             <w:tcBorders>
               <w:top w:val="single" w:sz="4" w:color="BBBBBB"/>
               <w:left w:val="single" w:sz="4" w:color="BBBBBB"/>
@@ -602,7 +602,7 @@
         <w:tc>
           <w:tcPr>
             <w:tcW w:type="dxa" w:w="4680"/>
-            <w:tcW w:type="dxa" w:w="2530"/>
+            <w:tcW w:type="dxa" w:w="3744"/>
             <w:tcBorders>
               <w:top w:val="single" w:sz="4" w:color="BBBBBB"/>
               <w:left w:val="single" w:sz="4" w:color="BBBBBB"/>
@@ -622,7 +622,7 @@
         <w:tc>
           <w:tcPr>
             <w:tcW w:type="dxa" w:w="4680"/>
-            <w:tcW w:type="dxa" w:w="6830"/>
+            <w:tcW w:type="dxa" w:w="5616"/>
             <w:tcBorders>
               <w:top w:val="single" w:sz="4" w:color="BBBBBB"/>
               <w:left w:val="single" w:sz="4" w:color="BBBBBB"/>
@@ -644,40 +644,40 @@
         <w:tc>
           <w:tcPr>
             <w:tcW w:type="dxa" w:w="4680"/>
-            <w:tcW w:type="dxa" w:w="2530"/>
-            <w:tcBorders>
-              <w:top w:val="single" w:sz="4" w:color="BBBBBB"/>
-              <w:left w:val="single" w:sz="4" w:color="BBBBBB"/>
-              <w:bottom w:val="single" w:sz="4" w:color="BBBBBB"/>
-              <w:right w:val="single" w:sz="4" w:color="BBBBBB"/>
-            </w:tcBorders>
-          </w:tcPr>
-          <w:p>
-            <w:pPr>
-              <w:keepNext/>
-            </w:pPr>
-            <w:r>
-              <w:t>Silenciar</w:t>
+            <w:tcW w:type="dxa" w:w="3744"/>
+            <w:tcBorders>
+              <w:top w:val="single" w:sz="4" w:color="BBBBBB"/>
+              <w:left w:val="single" w:sz="4" w:color="BBBBBB"/>
+              <w:bottom w:val="single" w:sz="4" w:color="BBBBBB"/>
+              <w:right w:val="single" w:sz="4" w:color="BBBBBB"/>
+            </w:tcBorders>
+          </w:tcPr>
+          <w:p>
+            <w:pPr>
+              <w:keepNext/>
+            </w:pPr>
+            <w:r>
+              <w:t>Pausa (continuar, otro nivel o menú)</w:t>
             </w:r>
           </w:p>
         </w:tc>
         <w:tc>
           <w:tcPr>
             <w:tcW w:type="dxa" w:w="4680"/>
-            <w:tcW w:type="dxa" w:w="6830"/>
-            <w:tcBorders>
-              <w:top w:val="single" w:sz="4" w:color="BBBBBB"/>
-              <w:left w:val="single" w:sz="4" w:color="BBBBBB"/>
-              <w:bottom w:val="single" w:sz="4" w:color="BBBBBB"/>
-              <w:right w:val="single" w:sz="4" w:color="BBBBBB"/>
-            </w:tcBorders>
-          </w:tcPr>
-          <w:p>
-            <w:pPr>
-              <w:keepNext/>
-            </w:pPr>
-            <w:r>
-              <w:t>M</w:t>
+            <w:tcW w:type="dxa" w:w="5616"/>
+            <w:tcBorders>
+              <w:top w:val="single" w:sz="4" w:color="BBBBBB"/>
+              <w:left w:val="single" w:sz="4" w:color="BBBBBB"/>
+              <w:bottom w:val="single" w:sz="4" w:color="BBBBBB"/>
+              <w:right w:val="single" w:sz="4" w:color="BBBBBB"/>
+            </w:tcBorders>
+          </w:tcPr>
+          <w:p>
+            <w:pPr>
+              <w:keepNext/>
+            </w:pPr>
+            <w:r>
+              <w:t>Esc</w:t>
             </w:r>
           </w:p>
         </w:tc>
@@ -686,7 +686,49 @@
         <w:tc>
           <w:tcPr>
             <w:tcW w:type="dxa" w:w="4680"/>
-            <w:tcW w:type="dxa" w:w="2530"/>
+            <w:tcW w:type="dxa" w:w="3744"/>
+            <w:tcBorders>
+              <w:top w:val="single" w:sz="4" w:color="BBBBBB"/>
+              <w:left w:val="single" w:sz="4" w:color="BBBBBB"/>
+              <w:bottom w:val="single" w:sz="4" w:color="BBBBBB"/>
+              <w:right w:val="single" w:sz="4" w:color="BBBBBB"/>
+            </w:tcBorders>
+          </w:tcPr>
+          <w:p>
+            <w:pPr>
+              <w:keepNext/>
+            </w:pPr>
+            <w:r>
+              <w:t>Silenciar</w:t>
+            </w:r>
+          </w:p>
+        </w:tc>
+        <w:tc>
+          <w:tcPr>
+            <w:tcW w:type="dxa" w:w="4680"/>
+            <w:tcW w:type="dxa" w:w="5616"/>
+            <w:tcBorders>
+              <w:top w:val="single" w:sz="4" w:color="BBBBBB"/>
+              <w:left w:val="single" w:sz="4" w:color="BBBBBB"/>
+              <w:bottom w:val="single" w:sz="4" w:color="BBBBBB"/>
+              <w:right w:val="single" w:sz="4" w:color="BBBBBB"/>
+            </w:tcBorders>
+          </w:tcPr>
+          <w:p>
+            <w:pPr>
+              <w:keepNext/>
+            </w:pPr>
+            <w:r>
+              <w:t>M</w:t>
+            </w:r>
+          </w:p>
+        </w:tc>
+      </w:tr>
+      <w:tr>
+        <w:tc>
+          <w:tcPr>
+            <w:tcW w:type="dxa" w:w="4680"/>
+            <w:tcW w:type="dxa" w:w="3744"/>
             <w:tcBorders>
               <w:top w:val="single" w:sz="4" w:color="BBBBBB"/>
               <w:left w:val="single" w:sz="4" w:color="BBBBBB"/>
@@ -703,7 +745,7 @@
         <w:tc>
           <w:tcPr>
             <w:tcW w:type="dxa" w:w="4680"/>
-            <w:tcW w:type="dxa" w:w="6830"/>
+            <w:tcW w:type="dxa" w:w="5616"/>
             <w:tcBorders>
               <w:top w:val="single" w:sz="4" w:color="BBBBBB"/>
               <w:left w:val="single" w:sz="4" w:color="BBBBBB"/>

</xml_diff>